<commit_message>
docs: 回填 Data Availability 的公开仓库 URL 并重出稿件 PDF
Data Availability 段末追加 https://github.com/ice917/bionic-tree-microchannel 与 MANIFEST.sha256 校验说明；DATA_AVAILABILITY.md 同步替换 URL 占位符。重出 PDF（40 页），validate_ijts 27 PASS / 0 FAIL / 2 PEND（Zenodo DOI、GenAI 声明待作者提供），check_pdf_ijts 17 PASS / 0 FAIL。MANIFEST 重签 182 项、0 失配。
</commit_message>
<xml_diff>
--- a/论文/submission_ijts/Manuscript_IJTS.docx
+++ b/论文/submission_ijts/Manuscript_IJTS.docx
@@ -17103,6 +17103,12 @@
           <w:rFonts w:eastAsia="Times New Roman"/>
         </w:rPr>
         <w:t>. Reproduction commands are given in the Appendix.</w:t>
+      </w:r>
+      <w:r>
+        <w:rPr>
+          <w:rFonts w:eastAsia="Times New Roman"/>
+        </w:rPr>
+        <w:t xml:space="preserve"> The complete source code and all artefacts listed above are openly available in the public repository at https://github.com/ice917/bionic-tree-microchannel; the SHA-256 checksums of every distributed file are recorded in MANIFEST.sha256 at the repository root.</w:t>
       </w:r>
     </w:p>
     <w:p>

</xml_diff>

<commit_message>
docs: 回填 Zenodo DOI（版本 23620419 / 概念 23620418）并重出期刊版 PDF
Zenodo 记录 23620419 已于 2026-10-24T14:45:14Z 发布，公开 API 核实 doi/conceptdoi/status=published/version=1.0.0/creators/license。稿件 Data Availability 段与 DATA_AVAILABILITY.md 英文/中文两版改为可解析的 DOI 链接；validate_ijts 中该 PEND 项改为可证伪断言（29 PASS / 0 FAIL / 1 PEND 仅剩 GenAI 声明）。MANIFEST 重签为 182 项，自校验 mismatch=0。
</commit_message>
<xml_diff>
--- a/论文/submission_ijts/Manuscript_IJTS.docx
+++ b/论文/submission_ijts/Manuscript_IJTS.docx
@@ -17109,6 +17109,12 @@
           <w:rFonts w:eastAsia="Times New Roman"/>
         </w:rPr>
         <w:t xml:space="preserve"> The complete source code and all artefacts listed above are openly available in the public repository at https://github.com/ice917/bionic-tree-microchannel; the SHA-256 checksums of every distributed file are recorded in MANIFEST.sha256 at the repository root.</w:t>
+      </w:r>
+      <w:r>
+        <w:rPr>
+          <w:rFonts w:eastAsia="Times New Roman"/>
+        </w:rPr>
+        <w:t xml:space="preserve"> The v1.0.0 snapshot of this repository is permanently archived at Zenodo under DOI 10.5281/zenodo.23620419, and the concept DOI 10.5281/zenodo.23620418 always resolves to the most recent archived version.</w:t>
       </w:r>
     </w:p>
     <w:p>

</xml_diff>